<commit_message>
docs: design document v0.7.0 — remediation status, propose(), drivers, PII storage
- Implementation Status updated to v0.7.0: all ten audit findings
  listed as resolved with fix summaries; test suite 505 passing,
  0 failures; known residuals (cap_output marker, CONTROL_MAP
  in_place assertion, PostgresDashboardUserStore tests) documented
- HITLLayer section documents propose(), the unconditional approval
  gate invoked on ToolGuard ESCALATE
- Persistence section covers SQLite (dev) and PostgreSQL (psycopg 3
  preferred, psycopg 2 via the _pg.py shim); no MySQL dependency
- ComplianceLayer PII section states scrubbed-only persistence with
  input_hash for caller verification

Co-Authored-By: Claude Fable 5 <noreply@anthropic.com>
</commit_message>
<xml_diff>
--- a/docs/Pramagent-Design-Document.docx
+++ b/docs/Pramagent-Design-Document.docx
@@ -25,12 +25,80 @@
         <w:rPr>
           <w:b/>
         </w:rPr>
-        <w:t xml:space="preserve">Current Implementation Status - v0.4 Anchoring + Archive MVP</w:t>
-      </w:r>
-    </w:p>
-    <w:p>
-      <w:r>
-        <w:t xml:space="preserve">This section is intentionally blunt. The original vision in this document is the target architecture, not a claim that every enterprise-grade control is mature today. Current local validation: python -m pytest -q --tb=no passes with 505 passing and 1 skipped (version 0.5.20 post-audit remediation). A syntax-health test now compiles every Python source file so store.py-style collection failures are caught immediately. Persistence is SQLite for development and PostgreSQL for production (there is no MySQL anywhere in the stack). The embedding-based injection classifier is optional: install pramagent[ml] (sentence-transformers) to enable it; without it the system uses the deterministic keyword fallback.</w:t>
+        <w:t xml:space="preserve">Current Implementation Status - v0.7.0 Post-Audit Remediation</w:t>
+      </w:r>
+    </w:p>
+    <w:p>
+      <w:r>
+        <w:t xml:space="preserve">This section is intentionally blunt. The original vision in this document is the target architecture, not a claim that every enterprise-grade control is mature today. Current local validation (version 0.7.0): python -m pytest -q --tb=no passes with 505 passing, 0 failures. A syntax-health test compiles every Python source file so store.py-style collection failures are caught immediately. The embedding-based injection classifier is optional: install pramagent[ml] (sentence-transformers) to enable it; without it the system uses the deterministic keyword fallback.</w:t>
+      </w:r>
+    </w:p>
+    <w:p>
+      <w:r>
+        <w:rPr>
+          <w:b/>
+        </w:rPr>
+        <w:t xml:space="preserve">Audit remediation status (v0.7.0): all ten findings from the 2026-06-09 full-spectrum engineering audit are resolved.</w:t>
+      </w:r>
+    </w:p>
+    <w:p>
+      <w:r>
+        <w:t xml:space="preserve">Finding #1 (Critical) — Unauthenticated unversioned sidecar routes: every unversioned route (/traces, /traces/{id}, /metrics, /usage, /usage/ledger, /hitl/pending, /hitl/{id}/decide) now carries the same tenant-auth dependency as /v1 and is hard-scoped to the caller’s tenant; cross-tenant reads and HITL decides return 404 so request ids never leak.</w:t>
+      </w:r>
+    </w:p>
+    <w:p>
+      <w:r>
+        <w:t xml:space="preserve">Finding #2 (High) — RCA replay returned reproducible:true unconditionally: replay() now derives pre- and post-phase verdicts separately (rule results carry a phase tag, and classifier verdicts are recorded as rule results), compares each to its stored counterpart, and returns reproducible only when they match. A tampered verdict is flagged as not reproducible.</w:t>
+      </w:r>
+    </w:p>
+    <w:p>
+      <w:r>
+        <w:t xml:space="preserve">Finding #3 (High) — Raw PII persisted in traces: input_text and output_text now store only the compliance-scrubbed copies, in both the trace store and the audit-chain payload. The original bytes are preserved only as input_hash.</w:t>
+      </w:r>
+    </w:p>
+    <w:p>
+      <w:r>
+        <w:t xml:space="preserve">Finding #4 (High) — Incomplete GDPR erasure: delete_for_tenant() now tombstones the tenant’s audit-chain payloads with SHA-256 markers and re-anchors the chain (subsequent link hashes recomputed), so erasure removes PII while chain verification still succeeds. Implemented across HashChainBackend, SQLiteStore, and PostgresStore.</w:t>
+      </w:r>
+    </w:p>
+    <w:p>
+      <w:r>
+        <w:t xml:space="preserve">Finding #5 (High) — Unauthenticated ownership bypass: tenant erase and retention prune refuse (403) when no authenticated tenant exists; an empty tenant no longer grants implicit ownership of every tenant’s data, and prune is always tenant-scoped.</w:t>
+      </w:r>
+    </w:p>
+    <w:p>
+      <w:r>
+        <w:t xml:space="preserve">Finding #6 (Med-High) — Dashboard default JWT secret: the dashboard refuses to start when PRAMAGENT_JWT_SECRET is unset or still the well-known default, mirroring the API’s config validation.</w:t>
+      </w:r>
+    </w:p>
+    <w:p>
+      <w:r>
+        <w:t xml:space="preserve">Finding #7 (Medium) — Untested FallbackProvider and PostgresStore: dedicated suites now cover failover, exhaustion, the Postgres hash chain, tenant isolation, and erasure; used_fallback is a structured ProviderResult field rather than a model-name substring match. The new tests also exposed and fixed a latent JSONB-handling bug in PostgresStore.</w:t>
+      </w:r>
+    </w:p>
+    <w:p>
+      <w:r>
+        <w:t xml:space="preserve">Finding #8 (Medium) — ToolGuard ESCALATE not wired to HITL: an ESCALATE verdict now invokes HITLLayer.propose() and the call does not proceed without approval (denial or silence short-circuits before any side effect); tool_guard.validate_output() runs on every provider output and withholds output that fails the exfiltration/schema checks.</w:t>
+      </w:r>
+    </w:p>
+    <w:p>
+      <w:r>
+        <w:t xml:space="preserve">Finding #9 (Medium) — Dependency floors permitted published advisories: python-multipart≥0.0.18, aiohttp≥3.10.11, psycopg[binary]≥3.1 replaces psycopg2-binary, upper caps on fastapi and web3, sentence-transformers shipped in the ml extra, and a pip-audit job added to CI.</w:t>
+      </w:r>
+    </w:p>
+    <w:p>
+      <w:r>
+        <w:t xml:space="preserve">Finding #10 (Medium) — Concurrency: ToolGuard side-effect history and call counters are mutated under a lock; the Redis history path uses an atomic Lua append (RPUSH+LTRIM+EXPIRE); ObservabilityLayer counters and the sorted latency list are lock-guarded. Multi-worker chain detection requires a shared Redis backend, now documented.</w:t>
+      </w:r>
+    </w:p>
+    <w:p>
+      <w:r>
+        <w:t xml:space="preserve">Test suite: 505 passing, 0 failures.</w:t>
+      </w:r>
+    </w:p>
+    <w:p>
+      <w:r>
+        <w:t xml:space="preserve">Known residuals: cap_output latency marker (cosmetic); CONTROL_MAP in_place assertion (compliance gap, backlog); PostgresDashboardUserStore tests (backlog).</w:t>
       </w:r>
     </w:p>
     <w:p>
@@ -3215,7 +3283,7 @@
           <w:sz w:val="21"/>
           <w:szCs w:val="21"/>
         </w:rPr>
-        <w:t xml:space="preserve">The reference implementation accompanying this document ships layers 1 through 8 in working, tested form, plus a FastAPI HTTP service, SQLite/PostgreSQL persistence, context-guarded PII scrubbing, per-session isolation, and basic observability metrics. The full test suite has 505 passing tests (1 skipped).</w:t>
+        <w:t xml:space="preserve">The reference implementation accompanying this document ships layers 1 through 8 in working, tested form, plus a FastAPI HTTP service, SQLite/PostgreSQL persistence, context-guarded PII scrubbing, per-session isolation, and basic observability metrics. The full test suite has 505 passing tests, 0 failures.</w:t>
       </w:r>
     </w:p>
     <w:p>
@@ -6604,6 +6672,24 @@
     </w:p>
     <w:p>
       <w:pPr>
+        <w:spacing w:after="80" w:before="60"/>
+      </w:pPr>
+      <w:r>
+        <w:rPr>
+          <w:rFonts w:ascii="Arial" w:cs="Arial" w:eastAsia="Arial" w:hAnsi="Arial"/>
+          <w:b w:val="false"/>
+          <w:bCs w:val="false"/>
+          <w:i w:val="false"/>
+          <w:iCs w:val="false"/>
+          <w:color w:val="2A2A2A"/>
+          <w:sz w:val="21"/>
+          <w:szCs w:val="21"/>
+        </w:rPr>
+        <w:t xml:space="preserve">Scrubbed text is stored in input_text/output_text and the audit chain. The original bytes are preserved only as input_hash for caller verification. Raw PII never enters the persisted record.</w:t>
+      </w:r>
+    </w:p>
+    <w:p>
+      <w:pPr>
         <w:pStyle w:val="Heading2"/>
         <w:spacing w:after="100" w:before="280"/>
       </w:pPr>
@@ -6914,6 +7000,24 @@
           <w:szCs w:val="21"/>
         </w:rPr>
         <w:t xml:space="preserve">The defining invariant: for an action registered as consequential, gate() awaits an approver with a timeout, and on timeout returns IDLE — the action is not taken. There is no configuration that turns silence into approval. The approver is an async callable returning True / False / None, which in production is a webhook, Slack, or PagerDuty integration.</w:t>
+      </w:r>
+    </w:p>
+    <w:p>
+      <w:pPr>
+        <w:spacing w:after="80" w:before="60"/>
+      </w:pPr>
+      <w:r>
+        <w:rPr>
+          <w:rFonts w:ascii="Arial" w:cs="Arial" w:eastAsia="Arial" w:hAnsi="Arial"/>
+          <w:b w:val="false"/>
+          <w:bCs w:val="false"/>
+          <w:i w:val="false"/>
+          <w:iCs w:val="false"/>
+          <w:color w:val="2A2A2A"/>
+          <w:sz w:val="21"/>
+          <w:szCs w:val="21"/>
+        </w:rPr>
+        <w:t xml:space="preserve">propose() is the unconditional approval gate invoked when ToolGuard returns ESCALATE. Unlike gate(), which is action-label-driven, propose() treats the tool decision itself as sufficient grounds for requiring human approval. It runs the same propose-and-wait flow with the same invariant — silence is never consent — so an escalated tool call completes only after an explicit human approval, and the decision is recorded in the trace.</w:t>
       </w:r>
     </w:p>
     <w:tbl>
@@ -8433,7 +8537,7 @@
           <w:sz w:val="25"/>
           <w:szCs w:val="25"/>
         </w:rPr>
-        <w:t xml:space="preserve">Persistence — SQLiteStore</w:t>
+        <w:t xml:space="preserve">Persistence — SQLiteStore and PostgresStore</w:t>
       </w:r>
     </w:p>
     <w:p>
@@ -8452,6 +8556,24 @@
           <w:szCs w:val="21"/>
         </w:rPr>
         <w:t xml:space="preserve">By default, traces live in memory (MemoryStore) and are lost on restart. For any real deployment, SQLiteStore persists both the trace records and the audit hash chain to a single file. The chain head is restored on startup, so verification and RCA continue to work across restarts. SQLiteStore implements both the TraceStore and AuditBackend interfaces, so a single object replaces both in-memory defaults.</w:t>
+      </w:r>
+    </w:p>
+    <w:p>
+      <w:pPr>
+        <w:spacing w:after="80" w:before="60"/>
+      </w:pPr>
+      <w:r>
+        <w:rPr>
+          <w:rFonts w:ascii="Arial" w:cs="Arial" w:eastAsia="Arial" w:hAnsi="Arial"/>
+          <w:b w:val="false"/>
+          <w:bCs w:val="false"/>
+          <w:i w:val="false"/>
+          <w:iCs w:val="false"/>
+          <w:color w:val="2A2A2A"/>
+          <w:sz w:val="21"/>
+          <w:szCs w:val="21"/>
+        </w:rPr>
+        <w:t xml:space="preserve">Driver support: SQLite for development, PostgreSQL (psycopg 3 preferred, psycopg 2 supported via the _pg.py shim) for production. No MySQL dependency.</w:t>
       </w:r>
     </w:p>
     <w:tbl>

</xml_diff>

<commit_message>
release: v0.7.3 security remediation
</commit_message>
<xml_diff>
--- a/docs/Pramagent-Design-Document.docx
+++ b/docs/Pramagent-Design-Document.docx
@@ -25,12 +25,12 @@
         <w:rPr>
           <w:b/>
         </w:rPr>
-        <w:t xml:space="preserve">Current Implementation Status - v0.7.1 Enterprise Review + Security Assessment Remediation</w:t>
-      </w:r>
-    </w:p>
-    <w:p>
-      <w:r>
-        <w:t xml:space="preserve">This section is intentionally blunt. The original vision in this document is the target architecture, not a claim that every enterprise-grade control is mature today. Current local validation (version 0.7.1): python -m pytest -q --tb=no passes with 547 passing, 0 failures. A syntax-health test compiles every Python source file so store.py-style collection failures are caught immediately. The embedding-based injection classifier is optional: install pramagent[ml] (sentence-transformers) to enable it; without it the system uses the deterministic keyword fallback.</w:t>
+        <w:t xml:space="preserve">Current Implementation Status - v0.7.3 Security Remediation Release</w:t>
+      </w:r>
+    </w:p>
+    <w:p>
+      <w:r>
+        <w:t xml:space="preserve">This section is intentionally blunt. The original vision in this document is the target architecture, not a claim that every enterprise-grade control is mature today. Current local validation (version 0.7.3): python -m pytest tests/ -q --tb=no passes with 558 passing, 1 skipped, 0 failures. A syntax-health test compiles every Python source file so store.py-style collection failures are caught immediately. The embedding-based injection classifier is optional: install pramagent[ml] (sentence-transformers) to enable it; without it the system uses the deterministic keyword fallback.</w:t>
       </w:r>
     </w:p>
     <w:p>
@@ -38,12 +38,12 @@
         <w:rPr>
           <w:b/>
         </w:rPr>
-        <w:t xml:space="preserve">Security posture (v0.7.1): Pilot-Ready — library AND reference deployment.</w:t>
-      </w:r>
-    </w:p>
-    <w:p>
-      <w:r>
-        <w:t xml:space="preserve">All findings from the 2026-06-10 enterprise pre-production code review (2 P0, 10 P1, 18 P2, 20 P3) and the 2026-06-10 formal security assessment are closed or explicitly deferred with reason; see the “v0.7.1 Remediation Status” section of pramagent_full_audit.md for the per-finding table. The reference Docker Compose / Helm stack now refuses to start on a published placeholder secret or without a persistent store, runs its datastores network-internal only, drops the dashboard container to a non-root user, and persists every trace and audit-chain link to PostgreSQL out of the box.</w:t>
+        <w:t xml:space="preserve">Security posture (v0.7.3): Pilot-Ready after remediation — still Alpha and not production-certified.</w:t>
+      </w:r>
+    </w:p>
+    <w:p>
+      <w:r>
+        <w:t xml:space="preserve">All findings from the 2026-06-10 enterprise pre-production code review (2 P0, 10 P1, 18 P2, 20 P3) and the 2026-06-10 formal security assessment are closed or explicitly deferred with reason; see the “v0.7.1 Remediation Status” and “v0.7.3 Security Prompt Remediation Status” sections of pramagent_full_audit.md for per-finding tables. The reference Docker Compose / Helm stack now refuses to start on a published placeholder secret or without a persistent store, runs its datastores network-internal only, drops the dashboard container to a non-root user, and persists every trace and audit-chain link to PostgreSQL out of the box.</w:t>
       </w:r>
     </w:p>
     <w:p>

</xml_diff>